<commit_message>
Explain data cleaning checks and text parsing in final report
</commit_message>
<xml_diff>
--- a/docs/臺灣房屋總價預測_正式報告.docx
+++ b/docs/臺灣房屋總價預測_正式報告.docx
@@ -6019,6 +6019,257 @@
         <w:t>程式與文件入口：https://github.com/ziyi930108/nycu-house-price-regression（私人儲存庫，需存取權限）。</w:t>
       </w:r>
     </w:p>
+    <w:p>
+      <w:r>
+        <w:br w:type="page"/>
+      </w:r>
+    </w:p>
+    <w:p>
+      <w:pPr>
+        <w:pStyle w:val="Heading1"/>
+      </w:pPr>
+      <w:r>
+        <w:t>附錄 資料清理的判斷依據</w:t>
+      </w:r>
+    </w:p>
+    <w:p>
+      <w:pPr>
+        <w:spacing w:after="140"/>
+      </w:pPr>
+      <w:r>
+        <w:rPr>
+          <w:sz w:val="20"/>
+        </w:rPr>
+        <w:t>本附錄補充第2章的實際程式規則，說明移除哪些資料、如何判斷，以及文字欄位如何轉換。原始檔案保留，不直接修改。</w:t>
+      </w:r>
+    </w:p>
+    <w:p>
+      <w:pPr>
+        <w:pStyle w:val="Heading2"/>
+      </w:pPr>
+      <w:r>
+        <w:t>移除混入表頭</w:t>
+      </w:r>
+    </w:p>
+    <w:p>
+      <w:pPr>
+        <w:spacing w:after="140"/>
+      </w:pPr>
+      <w:r>
+        <w:rPr>
+          <w:sz w:val="20"/>
+        </w:rPr>
+        <w:t>關鍵字：混入表頭、非交易資料、標籤格式檢查。對應程式：pd.to_numeric(errors="coerce")、np.isfinite、non_numeric_target。</w:t>
+      </w:r>
+    </w:p>
+    <w:p>
+      <w:pPr>
+        <w:spacing w:after="140"/>
+      </w:pPr>
+      <w:r>
+        <w:rPr>
+          <w:sz w:val="20"/>
+        </w:rPr>
+        <w:t>先把「總價元」嘗試轉為數值，找出無法轉換或不是有限數值的列；再逐列確認「編號」恰為 serial number，且「總價元」恰為 total price NTD，才允許移除。實際找到3列英文表頭，原455,787列因此剩455,784列。不是看到英文就刪除，也不是把所有轉換失敗的列默默刪掉。</w:t>
+      </w:r>
+    </w:p>
+    <w:p>
+      <w:pPr>
+        <w:spacing w:after="140"/>
+      </w:pPr>
+      <w:r>
+        <w:rPr>
+          <w:sz w:val="20"/>
+        </w:rPr>
+        <w:t>若格式異常的列不符合上述兩個英文值，程式會報錯停止；合法標籤若小於或等於0，也會停止。原始列號、編號、原總價文字與原因都有記錄。價格很高本身不是刪除理由。</w:t>
+      </w:r>
+    </w:p>
+    <w:p>
+      <w:pPr>
+        <w:pStyle w:val="Heading2"/>
+      </w:pPr>
+      <w:r>
+        <w:t>完全重複紀錄去重</w:t>
+      </w:r>
+    </w:p>
+    <w:p>
+      <w:pPr>
+        <w:spacing w:after="140"/>
+      </w:pPr>
+      <w:r>
+        <w:rPr>
+          <w:sz w:val="20"/>
+        </w:rPr>
+        <w:t>關鍵字：完全重複、排除識別碼、保留首次出現、避免重複加權。對應程式：duplicated(subset=[c for c in raw if c != ID])，再以反向遮罩保留未重複列。</w:t>
+      </w:r>
+    </w:p>
+    <w:p>
+      <w:pPr>
+        <w:spacing w:after="140"/>
+      </w:pPr>
+      <w:r>
+        <w:rPr>
+          <w:sz w:val="20"/>
+        </w:rPr>
+        <w:t>比較編號以外的全部原始欄位，包含成交總價；全部相同才視為符合去重規則。保留首次出現，移除後續529列，得到455,255筆訓練資料。即使編號不同，只要其餘欄位全部相同，仍會被此規則判為重複。</w:t>
+      </w:r>
+    </w:p>
+    <w:p>
+      <w:pPr>
+        <w:spacing w:after="140"/>
+      </w:pPr>
+      <w:r>
+        <w:rPr>
+          <w:sz w:val="20"/>
+        </w:rPr>
+        <w:t>例如地址、面積、日期、總價及其他所有欄位皆相同，只有編號不同，便保留一筆；若交易日期或總價不同，就不符合完全重複條件。同建案或相似房屋不足以判定重複；這是欄位去重規則，沒有經外部查證為同一真實交易。</w:t>
+      </w:r>
+    </w:p>
+    <w:p>
+      <w:pPr>
+        <w:spacing w:after="140"/>
+      </w:pPr>
+      <w:r>
+        <w:rPr>
+          <w:sz w:val="20"/>
+        </w:rPr>
+        <w:t>最終訓練合併11,994筆課程valid後，以同一規則再去除28筆跨集重複，得到467,221筆。另行評估課程valid時的重疊排除遮罩，使用不含編號與總價的特徵雜湊，與上述最終合併去重的判定用途不同。test完整保留47,073筆與指定順序。</w:t>
+      </w:r>
+    </w:p>
+    <w:p>
+      <w:r>
+        <w:br w:type="page"/>
+      </w:r>
+    </w:p>
+    <w:p>
+      <w:pPr>
+        <w:pStyle w:val="Heading1"/>
+      </w:pPr>
+      <w:r>
+        <w:t>附錄 文字欄位的實際轉換方式</w:t>
+      </w:r>
+    </w:p>
+    <w:p>
+      <w:pPr>
+        <w:spacing w:after="140"/>
+      </w:pPr>
+      <w:r>
+        <w:rPr>
+          <w:sz w:val="20"/>
+        </w:rPr>
+        <w:t>以下例子只示範程式規則，不是新增交易。固定格式解析可一致套用各資料集；需要從資料學習的填補、尺度與類別編碼，則只由當次訓練資料建立。</w:t>
+      </w:r>
+    </w:p>
+    <w:p>
+      <w:pPr>
+        <w:spacing w:after="140"/>
+      </w:pPr>
+      <w:r>
+        <w:rPr>
+          <w:sz w:val="20"/>
+        </w:rPr>
+        <w:t>文字與空白：去除前後空白及全形空白；空字串與 nan、NaN、None、null、&lt;NA&gt; 統一視為缺失。類別缺失使用 __MISSING__ 標記。</w:t>
+      </w:r>
+    </w:p>
+    <w:p>
+      <w:pPr>
+        <w:spacing w:after="140"/>
+      </w:pPr>
+      <w:r>
+        <w:rPr>
+          <w:sz w:val="20"/>
+        </w:rPr>
+        <w:t>數字文字：先去除千分位逗號，再轉為數值，例如「1,200.5」變成1200.5；轉換失敗保留為缺失。最後把正負無限大改為缺失，不把缺失直接當成0。</w:t>
+      </w:r>
+    </w:p>
+    <w:p>
+      <w:pPr>
+        <w:spacing w:after="140"/>
+      </w:pPr>
+      <w:r>
+        <w:rPr>
+          <w:sz w:val="20"/>
+        </w:rPr>
+        <w:t>交易日期：解析民國或西元日期；民國年加1911，例如「112年8月11日」轉為2023-08-11。擷取年、月、季、日、相對2000年的月份及天數索引，另建立月份sin與cos週期特徵。無效日期保留缺失標記；解析年份超出1990至2030者設缺失並加異常旗標，不截成邊界年份。</w:t>
+      </w:r>
+    </w:p>
+    <w:p>
+      <w:pPr>
+        <w:spacing w:after="140"/>
+      </w:pPr>
+      <w:r>
+        <w:rPr>
+          <w:sz w:val="20"/>
+        </w:rPr>
+        <w:t>樓層文字：把中文數字轉成數值，例如「十二層」解析為12，「地下二層」為−2；抽取最低、最高、平均樓層、層數與跨度，以及地下、整棟、屋頂旗標。範圍「三至五層」的層數為3；跨地下與地上時不計第0樓。總樓層優先直接轉數值，失敗再以樓層文字規則解析。</w:t>
+      </w:r>
+    </w:p>
+    <w:p>
+      <w:pPr>
+        <w:spacing w:after="140"/>
+      </w:pPr>
+      <w:r>
+        <w:rPr>
+          <w:sz w:val="20"/>
+        </w:rPr>
+        <w:t>地址與棟號：地址中的「台」統一成「臺」，用文字規則拆出縣市、行政區、道路、路段及里村段資訊，並標記地號型地址；另從棟及號抽取棟別與樓層。原始地址亦保留為類別，沒有據此宣稱精確門牌定位。</w:t>
+      </w:r>
+    </w:p>
+    <w:p>
+      <w:pPr>
+        <w:spacing w:after="140"/>
+      </w:pPr>
+      <w:r>
+        <w:rPr>
+          <w:sz w:val="20"/>
+        </w:rPr>
+        <w:t>交易筆棟數：依「土地」「建物」「車位」後的阿拉伯或中文數字分別擷取，例如「土地1建物1車位2」拆成土地1、建物1、車位2，供模型分別使用。</w:t>
+      </w:r>
+    </w:p>
+    <w:p>
+      <w:pPr>
+        <w:spacing w:after="140"/>
+      </w:pPr>
+      <w:r>
+        <w:rPr>
+          <w:sz w:val="20"/>
+        </w:rPr>
+        <w:t>面積與格局異常：保留可解析的原始數值，另外建立負值、面積為0、極大面積與異常房廳衛旗標。土地面積大於10,000或建物大於2,000平方公尺會標記；房或衛大於20、廳大於10也會標記。這些數值不因極端就直接刪除。</w:t>
+      </w:r>
+    </w:p>
+    <w:p>
+      <w:pPr>
+        <w:spacing w:after="140"/>
+      </w:pPr>
+      <w:r>
+        <w:rPr>
+          <w:sz w:val="20"/>
+        </w:rPr>
+        <w:t>有限備註標記：不輸入完整備註及其中價格文字；只依固定詞組建立0或1旗標，包括親友交易、裝潢、毛胚、增建、預售、持分、特殊出售與無建物等。</w:t>
+      </w:r>
+    </w:p>
+    <w:p>
+      <w:pPr>
+        <w:spacing w:after="140"/>
+      </w:pPr>
+      <w:r>
+        <w:rPr>
+          <w:sz w:val="20"/>
+        </w:rPr>
+        <w:t>模型需要的編碼：參考單價神經網路使用訓練資料的中位數、尺度與asinh轉換，並附非有限值旗標。類別建立訓練詞表；訓練中少於5次或預測時未見過的類別用0編碼。驗證及測試沿用已建立規則，不重新學習。</w:t>
+      </w:r>
+    </w:p>
+    <w:p>
+      <w:pPr>
+        <w:spacing w:after="140"/>
+      </w:pPr>
+      <w:r>
+        <w:rPr>
+          <w:sz w:val="20"/>
+        </w:rPr>
+        <w:t>程式依據：prepare_data.py 的 load_one；model_common.py 的 load_data 與 full_training_data；house_features.py 的 _text、_numeric、_date_parts、_floor_tuple 與 build_features；神經網路編碼依既有訓練編碼流程。</w:t>
+      </w:r>
+    </w:p>
     <w:sectPr>
       <w:footerReference w:type="default" r:id="rId9"/>
       <w:pgSz w:w="11906" w:h="16838"/>

</xml_diff>

<commit_message>
Add author name and student number to report
</commit_message>
<xml_diff>
--- a/docs/臺灣房屋總價預測_正式報告.docx
+++ b/docs/臺灣房屋總價預測_正式報告.docx
@@ -16,6 +16,28 @@
       </w:pPr>
       <w:r>
         <w:t>方法與實驗報告</w:t>
+      </w:r>
+    </w:p>
+    <w:p>
+      <w:pPr>
+        <w:spacing w:after="60"/>
+      </w:pPr>
+      <w:r>
+        <w:rPr>
+          <w:sz w:val="22"/>
+        </w:rPr>
+        <w:t>姓名：廖子頤</w:t>
+      </w:r>
+    </w:p>
+    <w:p>
+      <w:pPr>
+        <w:spacing w:after="60"/>
+      </w:pPr>
+      <w:r>
+        <w:rPr>
+          <w:sz w:val="22"/>
+        </w:rPr>
+        <w:t>學號：315581048</w:t>
       </w:r>
     </w:p>
     <w:p>

</xml_diff>

<commit_message>
Remove report subtitle as requested
</commit_message>
<xml_diff>
--- a/docs/臺灣房屋總價預測_正式報告.docx
+++ b/docs/臺灣房屋總價預測_正式報告.docx
@@ -8,14 +8,6 @@
       </w:pPr>
       <w:r>
         <w:t>台灣房屋銷售價格預測挑戰賽</w:t>
-      </w:r>
-    </w:p>
-    <w:p>
-      <w:pPr>
-        <w:pStyle w:val="Subtitle"/>
-      </w:pPr>
-      <w:r>
-        <w:t>方法與實驗報告</w:t>
       </w:r>
     </w:p>
     <w:p>

</xml_diff>

<commit_message>
Remove selected results paragraph from abstract
</commit_message>
<xml_diff>
--- a/docs/臺灣房屋總價預測_正式報告.docx
+++ b/docs/臺灣房屋總價預測_正式報告.docx
@@ -48,11 +48,6 @@
     <w:p>
       <w:r>
         <w:t>本研究以課程提供的臺灣房屋交易資料建立總價回歸方法。預測流程結合 CatBoost、LightGBM 與兩個神經網路，共六個模型；各模型輸出統一換算為總價後形成三路預測，再結合可比成交與空間資訊修正，最後逐筆取中位數。參考單價神經網路採日期加權 SmoothL1，其餘模型與融合設定固定，以檢驗此訓練設計對完整流程的影響。[1][2]</w:t>
-      </w:r>
-    </w:p>
-    <w:p>
-      <w:r>
-        <w:t>三個主要歷史驗證期間中，本研究方法有兩期改善、一期退步；最近一期總價 MAE 為 1,381,702.87 元，相較基準降低 1,525.54 元。依回報的 Public 成績，本研究 MAE 為 1,995,836.2136 元，相較基準降低約 0.1367%。這些結果顯示本研究方法有小幅改善，但驗證窗口曾反覆使用、分群效果不一致，且 Private 成績未知，不能保證未來資料皆有改善。[1][3]</w:t>
       </w:r>
     </w:p>
     <w:p>

</xml_diff>

<commit_message>
Remove research self references from report wording
</commit_message>
<xml_diff>
--- a/docs/臺灣房屋總價預測_正式報告.docx
+++ b/docs/臺灣房屋總價預測_正式報告.docx
@@ -47,7 +47,7 @@
     </w:p>
     <w:p>
       <w:r>
-        <w:t>本研究以課程提供的臺灣房屋交易資料建立總價回歸方法。預測流程結合 CatBoost、LightGBM 與兩個神經網路，共六個模型；各模型輸出統一換算為總價後形成三路預測，再結合可比成交與空間資訊修正，最後逐筆取中位數。參考單價神經網路採日期加權 SmoothL1，其餘模型與融合設定固定，以檢驗此訓練設計對完整流程的影響。[1][2]</w:t>
+        <w:t>以課程提供的臺灣房屋交易資料建立總價回歸方法。預測流程結合 CatBoost、LightGBM 與兩個神經網路，共六個模型；各模型輸出統一換算為總價後形成三路預測，再結合可比成交與空間資訊修正，最後逐筆取中位數。參考單價神經網路採日期加權 SmoothL1，其餘模型與融合設定固定，以檢驗此訓練設計對完整流程的影響。[1][2]</w:t>
       </w:r>
     </w:p>
     <w:p>
@@ -60,7 +60,7 @@
     </w:p>
     <w:p>
       <w:r>
-        <w:t>本研究預測每筆交易的房屋總價，而非直接將單價作為最終答案。輸入包含位置、面積、樓層、建物類型及交易日期等資訊。模型需利用已知交易學習關係，再對未提供成交總價的測試資料產生預測。</w:t>
+        <w:t>預測每筆交易的房屋總價，而非直接將單價作為最終答案。輸入包含位置、面積、樓層、建物類型及交易日期等資訊。模型需利用已知交易學習關係，再對未提供成交總價的測試資料產生預測。</w:t>
       </w:r>
     </w:p>
     <w:p>
@@ -4140,7 +4140,7 @@
     </w:p>
     <w:p>
       <w:r>
-        <w:t>以下金額皆為新臺幣元；差值為本研究方法減基準，負值表示改善。基準方法僅用於衡量本研究設計的差異。</w:t>
+        <w:t>以下金額皆為新臺幣元；差值為此方法減基準，負值表示改善。基準方法僅用於衡量此設計的差異。</w:t>
       </w:r>
     </w:p>
     <w:tbl>
@@ -4253,7 +4253,7 @@
                 <w:b/>
                 <w:sz w:val="18"/>
               </w:rPr>
-              <w:t>本研究 MAE</w:t>
+              <w:t>此方法 MAE</w:t>
             </w:r>
           </w:p>
         </w:tc>
@@ -4862,7 +4862,7 @@
         <w:rPr>
           <w:sz w:val="20"/>
         </w:rPr>
-        <w:t>原強條件要求三窗整體及固定加權均改善、最近整體至少改善 0.5%，並檢查季度與大型群退步幅度。本研究方法未通過此強條件；它通過的是事前另固定的探索提交條件。後續 Public 回報與最終選定，不會把原強條件的失敗改寫為通過。</w:t>
+        <w:t>原強條件要求三窗整體及固定加權均改善、最近整體至少改善 0.5%，並檢查季度與大型群退步幅度。此方法未通過此強條件；它通過的是事前另固定的探索提交條件。後續 Public 回報與最終選定，不會把原強條件的失敗改寫為通過。</w:t>
       </w:r>
     </w:p>
     <w:p>
@@ -5130,7 +5130,7 @@
                 <w:b w:val="0"/>
                 <w:sz w:val="18"/>
               </w:rPr>
-              <w:t>本研究方法</w:t>
+              <w:t>此方法</w:t>
             </w:r>
           </w:p>
         </w:tc>
@@ -5231,7 +5231,7 @@
                 <w:b w:val="0"/>
                 <w:sz w:val="18"/>
               </w:rPr>
-              <w:t>差值本研究減基準</w:t>
+              <w:t>差值此方法減基準</w:t>
             </w:r>
           </w:p>
         </w:tc>
@@ -5308,7 +5308,7 @@
     </w:p>
     <w:p>
       <w:r>
-        <w:t>本研究方法的 Public MAE 約 199.58 萬元，與基準相差約 2,732 元。這不表示每間房屋都少錯相同金額。分數由回報紀錄取得，未另登入平台核對實際上傳檔案的 bytes；Private 仍未知。</w:t>
+        <w:t>此方法的 Public MAE 約 199.58 萬元，與基準相差約 2,732 元。這不表示每間房屋都少錯相同金額。分數由回報紀錄取得，未另登入平台核對實際上傳檔案的 bytes；Private 仍未知。</w:t>
       </w:r>
     </w:p>
     <w:p>
@@ -5339,7 +5339,7 @@
     </w:p>
     <w:p>
       <w:r>
-        <w:t>另一對照方法在原三期整體及固定加權回測均優於基準方法，但其 Public MAE 為 2,083,045.2932 元，反而較差。它也在最早及最近年度的離線 MAE 優於本研究方法。這項反例顯示離線改善不能保證平台成績改善，不能只保留支持最終方法的結果。[1][3]</w:t>
+        <w:t>另一對照方法在原三期整體及固定加權回測均優於基準方法，但其 Public MAE 為 2,083,045.2932 元，反而較差。它也在最早及最近年度的離線 MAE 優於此方法。這項反例顯示離線改善不能保證平台成績改善，不能只保留支持最終方法的結果。[1][3]</w:t>
       </w:r>
     </w:p>
     <w:p>
@@ -5835,7 +5835,7 @@
     </w:p>
     <w:p>
       <w:r>
-        <w:t>已保存來源、設定、訓練 metadata、模型重載檢查、各路預測與 CSV 身分證據，支持追溯本次結果。GitHub 提供本研究文件與必要來源，不包含課程交易表、私有模型或提交 CSV。</w:t>
+        <w:t>已保存來源、設定、訓練 metadata、模型重載檢查、各路預測與 CSV 身分證據，支持追溯本次結果。GitHub 提供相關文件與必要來源，不包含課程交易表、私有模型或提交 CSV。</w:t>
       </w:r>
     </w:p>
     <w:p>
@@ -5858,12 +5858,12 @@
     </w:p>
     <w:p>
       <w:r>
-        <w:t>本研究將六個模型的不同價格表示統一為房屋總價，透過三路融合、可比成交與空間修正，再以中位數形成最終預測。其中，參考單價神經網路採日期加權 SmoothL1，在較近兩個主要歷史驗證期間及 Public 評分中有小幅改善，並作為最終提交方法。</w:t>
+        <w:t>將六個模型的不同價格表示統一為房屋總價，透過三路融合、可比成交與空間修正，再以中位數形成最終預測。其中，參考單價神經網路採日期加權 SmoothL1，在較近兩個主要歷史驗證期間及 Public 評分中有小幅改善，並作為最終提交方法。</w:t>
       </w:r>
     </w:p>
     <w:p>
       <w:r>
-        <w:t>改善不一致：較早一期及最近一期既有建案群仍退步，驗證窗口已反覆使用，重抽樣區間跨零，Private 也未知。本研究的結論限於目前評估證據，不保證任何未來年度、房屋群或隱藏測試部分皆改善。後續若進一步研究，應先固定假設與評估程序，優先檢查新的時間留出資料及多 seed 變異，並補齊乾淨環境重現。這些是後續方向，並非已完成工作。</w:t>
+        <w:t>改善不一致：較早一期及最近一期既有建案群仍退步，驗證窗口已反覆使用，重抽樣區間跨零，Private 也未知。結論限於目前評估證據，不保證任何未來年度、房屋群或隱藏測試部分皆改善。後續若進一步研究，應先固定假設與評估程序，優先檢查新的時間留出資料及多 seed 變異，並補齊乾淨環境重現。這些是後續方向，並非已完成工作。</w:t>
       </w:r>
     </w:p>
     <w:p>

</xml_diff>

<commit_message>
Remove date from report first page
</commit_message>
<xml_diff>
--- a/docs/臺灣房屋總價預測_正式報告.docx
+++ b/docs/臺灣房屋總價預測_正式報告.docx
@@ -30,11 +30,6 @@
           <w:sz w:val="22"/>
         </w:rPr>
         <w:t>學號：315581048</w:t>
-      </w:r>
-    </w:p>
-    <w:p>
-      <w:r>
-        <w:t>報告日期  2026 年 10 月 12 日</w:t>
       </w:r>
     </w:p>
     <w:p>

</xml_diff>